<commit_message>
Add Markdown previews for Word submission package
Co-authored-by: arena-agent <297053741+arena-agent@users.noreply.github.com>
</commit_message>
<xml_diff>
--- a/subhealth-review/submission-package-2026-10-15/Cover_Letter_SchemeB_Author_Review.docx
+++ b/subhealth-review/submission-package-2026-10-15/Cover_Letter_SchemeB_Author_Review.docx
@@ -77,22 +77,22 @@
     </w:p>
     <w:p>
       <w:r>
-        <w:rPr>
-          <w:i/>
-        </w:rPr>
-        <w:br/>
-        <w:t xml:space="preserve">Corresponding author: </w:t>
+        <w:t>*</w:t>
       </w:r>
+    </w:p>
+    <w:p>
       <w:r>
-        <w:br/>
-        <w:t xml:space="preserve">Affiliation: </w:t>
+        <w:t>Corresponding author: *</w:t>
       </w:r>
+    </w:p>
+    <w:p>
       <w:r>
-        <w:rPr>
-          <w:i/>
-        </w:rPr>
-        <w:br/>
-        <w:t xml:space="preserve">Email: </w:t>
+        <w:t>Affiliation: *</w:t>
+      </w:r>
+    </w:p>
+    <w:p>
+      <w:r>
+        <w:t>Email: *</w:t>
       </w:r>
     </w:p>
     <w:p>

</xml_diff>